<commit_message>
reference docx: add TOC3 + TableofFigures styles (subsubsection TOC, LOT/LOF); bump
Two missing Word styles in the reference docs made the new heading level and the caption lists render wrong: (1) the TOC field is 'TOC \o "1-3"' but only TOC1/TOC2 were defined, so subsubsection (level-3) entries fell back to an oversized style -- added TOC3 (9pt, matching the 11->10->9 progression); (2) List of Tables/Figures are 'TOC \c' fields styled by Word's 'Table of Figures' style, which was undefined and fell back to the bold/blue caption look -- added a TableofFigures style (9pt, gray 595959, regular weight). Applied to both custom_reference.docx and custom_reference-listings.docx. Page-number footer is untouched. Adds test_reference_styles.do to guard that both docs keep defining TOC1-3 and TableofFigures.
</commit_message>
<xml_diff>
--- a/ressources/custom_reference-listings.docx
+++ b/ressources/custom_reference-listings.docx
@@ -10632,6 +10632,41 @@
       <w:sz w:val="20"/>
     </w:rPr>
   </w:style>
+  <w:style w:type="paragraph" w:styleId="TOC3">
+    <w:name w:val="toc 3"/>
+    <w:basedOn w:val="Normal"/>
+    <w:next w:val="Normal"/>
+    <w:autoRedefine/>
+    <w:uiPriority w:val="39"/>
+    <w:unhideWhenUsed/>
+    <w:pPr>
+      <w:spacing w:before="120" w:after="220"/>
+      <w:ind w:left="480"/>
+    </w:pPr>
+    <w:rPr>
+      <w:rFonts w:ascii="Times New Roman" w:hAnsi="Times New Roman"/>
+      <w:sz w:val="18"/>
+    </w:rPr>
+  </w:style>
+  <w:style w:type="paragraph" w:styleId="TableofFigures">
+    <w:name w:val="table of figures"/>
+    <w:basedOn w:val="Normal"/>
+    <w:next w:val="Normal"/>
+    <w:autoRedefine/>
+    <w:uiPriority w:val="99"/>
+    <w:unhideWhenUsed/>
+    <w:pPr>
+      <w:spacing w:after="100"/>
+    </w:pPr>
+    <w:rPr>
+      <w:rFonts w:ascii="Times New Roman" w:hAnsi="Times New Roman"/>
+      <w:b w:val="0"/>
+      <w:bCs w:val="0"/>
+      <w:i w:val="0"/>
+      <w:color w:val="595959"/>
+      <w:sz w:val="18"/>
+    </w:rPr>
+  </w:style>
 </w:styles>
 </file>
 

</xml_diff>